<commit_message>
Xây dựng category api, ui admin
</commit_message>
<xml_diff>
--- a/tmdt.docx
+++ b/tmdt.docx
@@ -446,6 +446,748 @@
       </w:r>
     </w:p>
     <w:p>
+      <w:pPr>
+        <w:rPr>
+          <w:rFonts w:hint="default"/>
+        </w:rPr>
+      </w:pPr>
+      <w:r>
+        <w:rPr>
+          <w:rFonts w:hint="default"/>
+        </w:rPr>
+        <w:t>);</w:t>
+      </w:r>
+    </w:p>
+    <w:p>
+      <w:pPr>
+        <w:rPr>
+          <w:rFonts w:hint="default"/>
+        </w:rPr>
+      </w:pPr>
+    </w:p>
+    <w:p>
+      <w:pPr>
+        <w:rPr>
+          <w:rFonts w:hint="default"/>
+        </w:rPr>
+      </w:pPr>
+      <w:r>
+        <w:rPr>
+          <w:rFonts w:hint="default"/>
+        </w:rPr>
+        <w:t>--</w:t>
+      </w:r>
+      <w:r>
+        <w:rPr>
+          <w:rFonts w:hint="default"/>
+          <w:lang w:val="en-US"/>
+        </w:rPr>
+        <w:t xml:space="preserve"> 4.</w:t>
+      </w:r>
+      <w:r>
+        <w:rPr>
+          <w:rFonts w:hint="default"/>
+        </w:rPr>
+        <w:t xml:space="preserve"> Tạo bảng categories</w:t>
+      </w:r>
+    </w:p>
+    <w:p>
+      <w:pPr>
+        <w:rPr>
+          <w:rFonts w:hint="default"/>
+        </w:rPr>
+      </w:pPr>
+      <w:r>
+        <w:rPr>
+          <w:rFonts w:hint="default"/>
+        </w:rPr>
+        <w:t>CREATE TABLE categories (</w:t>
+      </w:r>
+    </w:p>
+    <w:p>
+      <w:pPr>
+        <w:rPr>
+          <w:rFonts w:hint="default"/>
+        </w:rPr>
+      </w:pPr>
+      <w:r>
+        <w:rPr>
+          <w:rFonts w:hint="default"/>
+        </w:rPr>
+        <w:t xml:space="preserve">    id INT AUTO_INCREMENT PRIMARY KEY,</w:t>
+      </w:r>
+    </w:p>
+    <w:p>
+      <w:pPr>
+        <w:rPr>
+          <w:rFonts w:hint="default"/>
+        </w:rPr>
+      </w:pPr>
+      <w:r>
+        <w:rPr>
+          <w:rFonts w:hint="default"/>
+        </w:rPr>
+        <w:t xml:space="preserve">    name VARCHAR(255) NOT NULL UNIQUE,</w:t>
+      </w:r>
+    </w:p>
+    <w:p>
+      <w:pPr>
+        <w:rPr>
+          <w:rFonts w:hint="default"/>
+        </w:rPr>
+      </w:pPr>
+      <w:r>
+        <w:rPr>
+          <w:rFonts w:hint="default"/>
+        </w:rPr>
+        <w:t xml:space="preserve">    status TINYINT DEFAULT 0 COMMENT '0: active, 1: inactive',</w:t>
+      </w:r>
+    </w:p>
+    <w:p>
+      <w:pPr>
+        <w:rPr>
+          <w:rFonts w:hint="default"/>
+        </w:rPr>
+      </w:pPr>
+      <w:r>
+        <w:rPr>
+          <w:rFonts w:hint="default"/>
+        </w:rPr>
+        <w:t xml:space="preserve">    created_at TIMESTAMP DEFAULT CURRENT_TIMESTAMP</w:t>
+      </w:r>
+    </w:p>
+    <w:p>
+      <w:pPr>
+        <w:rPr>
+          <w:rFonts w:hint="default"/>
+        </w:rPr>
+      </w:pPr>
+      <w:r>
+        <w:rPr>
+          <w:rFonts w:hint="default"/>
+        </w:rPr>
+        <w:t>);</w:t>
+      </w:r>
+    </w:p>
+    <w:p>
+      <w:pPr>
+        <w:rPr>
+          <w:rFonts w:hint="default"/>
+        </w:rPr>
+      </w:pPr>
+    </w:p>
+    <w:p>
+      <w:pPr>
+        <w:rPr>
+          <w:rFonts w:hint="default"/>
+        </w:rPr>
+      </w:pPr>
+      <w:r>
+        <w:rPr>
+          <w:rFonts w:hint="default"/>
+        </w:rPr>
+        <w:t>-- 5. Tạo bảng products</w:t>
+      </w:r>
+    </w:p>
+    <w:p>
+      <w:pPr>
+        <w:rPr>
+          <w:rFonts w:hint="default"/>
+        </w:rPr>
+      </w:pPr>
+      <w:r>
+        <w:rPr>
+          <w:rFonts w:hint="default"/>
+        </w:rPr>
+        <w:t>CREATE TABLE products (</w:t>
+      </w:r>
+    </w:p>
+    <w:p>
+      <w:pPr>
+        <w:rPr>
+          <w:rFonts w:hint="default"/>
+        </w:rPr>
+      </w:pPr>
+      <w:r>
+        <w:rPr>
+          <w:rFonts w:hint="default"/>
+        </w:rPr>
+        <w:t xml:space="preserve">    id INT AUTO_INCREMENT PRIMARY KEY,</w:t>
+      </w:r>
+    </w:p>
+    <w:p>
+      <w:pPr>
+        <w:rPr>
+          <w:rFonts w:hint="default"/>
+        </w:rPr>
+      </w:pPr>
+      <w:r>
+        <w:rPr>
+          <w:rFonts w:hint="default"/>
+        </w:rPr>
+        <w:t xml:space="preserve">    store_id INT NOT NULL,</w:t>
+      </w:r>
+    </w:p>
+    <w:p>
+      <w:pPr>
+        <w:rPr>
+          <w:rFonts w:hint="default"/>
+        </w:rPr>
+      </w:pPr>
+      <w:r>
+        <w:rPr>
+          <w:rFonts w:hint="default"/>
+        </w:rPr>
+        <w:t xml:space="preserve">    category_id INT NOT NULL,</w:t>
+      </w:r>
+    </w:p>
+    <w:p>
+      <w:pPr>
+        <w:rPr>
+          <w:rFonts w:hint="default"/>
+        </w:rPr>
+      </w:pPr>
+      <w:r>
+        <w:rPr>
+          <w:rFonts w:hint="default"/>
+        </w:rPr>
+        <w:t xml:space="preserve">    name VARCHAR(255) NOT NULL,</w:t>
+      </w:r>
+    </w:p>
+    <w:p>
+      <w:pPr>
+        <w:rPr>
+          <w:rFonts w:hint="default"/>
+        </w:rPr>
+      </w:pPr>
+      <w:r>
+        <w:rPr>
+          <w:rFonts w:hint="default"/>
+        </w:rPr>
+        <w:t xml:space="preserve">    status TINYINT DEFAULT 1 COMMENT '0: ngừng, 1: hoạt động',</w:t>
+      </w:r>
+    </w:p>
+    <w:p>
+      <w:pPr>
+        <w:rPr>
+          <w:rFonts w:hint="default"/>
+        </w:rPr>
+      </w:pPr>
+      <w:r>
+        <w:rPr>
+          <w:rFonts w:hint="default"/>
+        </w:rPr>
+        <w:t xml:space="preserve">    timestamp TIMESTAMP DEFAULT CURRENT_TIMESTAMP,</w:t>
+      </w:r>
+    </w:p>
+    <w:p>
+      <w:pPr>
+        <w:rPr>
+          <w:rFonts w:hint="default"/>
+        </w:rPr>
+      </w:pPr>
+      <w:r>
+        <w:rPr>
+          <w:rFonts w:hint="default"/>
+        </w:rPr>
+        <w:t xml:space="preserve">    </w:t>
+      </w:r>
+    </w:p>
+    <w:p>
+      <w:pPr>
+        <w:rPr>
+          <w:rFonts w:hint="default"/>
+        </w:rPr>
+      </w:pPr>
+      <w:r>
+        <w:rPr>
+          <w:rFonts w:hint="default"/>
+        </w:rPr>
+        <w:t xml:space="preserve">    CONSTRAINT fk_product_store FOREIGN KEY (store_id) REFERENCES stores(id) ON DELETE CASCADE,</w:t>
+      </w:r>
+    </w:p>
+    <w:p>
+      <w:pPr>
+        <w:rPr>
+          <w:rFonts w:hint="default"/>
+        </w:rPr>
+      </w:pPr>
+      <w:r>
+        <w:rPr>
+          <w:rFonts w:hint="default"/>
+        </w:rPr>
+        <w:t xml:space="preserve">    CONSTRAINT fk_product_category FOREIGN KEY (category_id) REFERENCES categories(id) ON DELETE CASCADE</w:t>
+      </w:r>
+    </w:p>
+    <w:p>
+      <w:pPr>
+        <w:rPr>
+          <w:rFonts w:hint="default"/>
+        </w:rPr>
+      </w:pPr>
+      <w:r>
+        <w:rPr>
+          <w:rFonts w:hint="default"/>
+        </w:rPr>
+        <w:t>);</w:t>
+      </w:r>
+    </w:p>
+    <w:p>
+      <w:pPr>
+        <w:rPr>
+          <w:rFonts w:hint="default"/>
+        </w:rPr>
+      </w:pPr>
+    </w:p>
+    <w:p>
+      <w:pPr>
+        <w:rPr>
+          <w:rFonts w:hint="default"/>
+        </w:rPr>
+      </w:pPr>
+      <w:r>
+        <w:rPr>
+          <w:rFonts w:hint="default"/>
+        </w:rPr>
+        <w:t>-- 6. Tạo bảng product_images (Lưu nhiều ảnh cho 1 sản phẩm)</w:t>
+      </w:r>
+    </w:p>
+    <w:p>
+      <w:pPr>
+        <w:rPr>
+          <w:rFonts w:hint="default"/>
+        </w:rPr>
+      </w:pPr>
+      <w:r>
+        <w:rPr>
+          <w:rFonts w:hint="default"/>
+        </w:rPr>
+        <w:t>CREATE TABLE product_images (</w:t>
+      </w:r>
+    </w:p>
+    <w:p>
+      <w:pPr>
+        <w:rPr>
+          <w:rFonts w:hint="default"/>
+        </w:rPr>
+      </w:pPr>
+      <w:r>
+        <w:rPr>
+          <w:rFonts w:hint="default"/>
+        </w:rPr>
+        <w:t xml:space="preserve">    id INT AUTO_INCREMENT PRIMARY KEY,</w:t>
+      </w:r>
+    </w:p>
+    <w:p>
+      <w:pPr>
+        <w:rPr>
+          <w:rFonts w:hint="default"/>
+        </w:rPr>
+      </w:pPr>
+      <w:r>
+        <w:rPr>
+          <w:rFonts w:hint="default"/>
+        </w:rPr>
+        <w:t xml:space="preserve">    product_id INT NOT NULL,</w:t>
+      </w:r>
+    </w:p>
+    <w:p>
+      <w:pPr>
+        <w:rPr>
+          <w:rFonts w:hint="default"/>
+        </w:rPr>
+      </w:pPr>
+      <w:r>
+        <w:rPr>
+          <w:rFonts w:hint="default"/>
+        </w:rPr>
+        <w:t xml:space="preserve">    image VARCHAR(255) NOT NULL,</w:t>
+      </w:r>
+    </w:p>
+    <w:p>
+      <w:pPr>
+        <w:rPr>
+          <w:rFonts w:hint="default"/>
+        </w:rPr>
+      </w:pPr>
+      <w:r>
+        <w:rPr>
+          <w:rFonts w:hint="default"/>
+        </w:rPr>
+        <w:t xml:space="preserve">    isMain TINYINT DEFAULT 0 COMMENT '0: phụ, 1: ảnh chính',</w:t>
+      </w:r>
+    </w:p>
+    <w:p>
+      <w:pPr>
+        <w:rPr>
+          <w:rFonts w:hint="default"/>
+        </w:rPr>
+      </w:pPr>
+      <w:r>
+        <w:rPr>
+          <w:rFonts w:hint="default"/>
+        </w:rPr>
+        <w:t xml:space="preserve">    created_at TIMESTAMP DEFAULT CURRENT_TIMESTAMP,</w:t>
+      </w:r>
+    </w:p>
+    <w:p>
+      <w:pPr>
+        <w:rPr>
+          <w:rFonts w:hint="default"/>
+        </w:rPr>
+      </w:pPr>
+      <w:r>
+        <w:rPr>
+          <w:rFonts w:hint="default"/>
+        </w:rPr>
+        <w:t xml:space="preserve">    </w:t>
+      </w:r>
+    </w:p>
+    <w:p>
+      <w:pPr>
+        <w:rPr>
+          <w:rFonts w:hint="default"/>
+        </w:rPr>
+      </w:pPr>
+      <w:r>
+        <w:rPr>
+          <w:rFonts w:hint="default"/>
+        </w:rPr>
+        <w:t xml:space="preserve">    CONSTRAINT fk_image_product FOREIGN KEY (product_id) REFERENCES products(id) ON DELETE CASCADE</w:t>
+      </w:r>
+    </w:p>
+    <w:p>
+      <w:pPr>
+        <w:rPr>
+          <w:rFonts w:hint="default"/>
+        </w:rPr>
+      </w:pPr>
+      <w:r>
+        <w:rPr>
+          <w:rFonts w:hint="default"/>
+        </w:rPr>
+        <w:t>);</w:t>
+      </w:r>
+    </w:p>
+    <w:p>
+      <w:pPr>
+        <w:rPr>
+          <w:rFonts w:hint="default"/>
+        </w:rPr>
+      </w:pPr>
+    </w:p>
+    <w:p>
+      <w:pPr>
+        <w:rPr>
+          <w:rFonts w:hint="default"/>
+        </w:rPr>
+      </w:pPr>
+      <w:r>
+        <w:rPr>
+          <w:rFonts w:hint="default"/>
+        </w:rPr>
+        <w:t>-- 7. Tạo bảng product_descriptions (Mô tả chi tiết theo từng đoạn/tiêu đề)</w:t>
+      </w:r>
+    </w:p>
+    <w:p>
+      <w:pPr>
+        <w:rPr>
+          <w:rFonts w:hint="default"/>
+        </w:rPr>
+      </w:pPr>
+      <w:r>
+        <w:rPr>
+          <w:rFonts w:hint="default"/>
+        </w:rPr>
+        <w:t>CREATE TABLE product_descriptions (</w:t>
+      </w:r>
+    </w:p>
+    <w:p>
+      <w:pPr>
+        <w:rPr>
+          <w:rFonts w:hint="default"/>
+        </w:rPr>
+      </w:pPr>
+      <w:r>
+        <w:rPr>
+          <w:rFonts w:hint="default"/>
+        </w:rPr>
+        <w:t xml:space="preserve">    id INT AUTO_INCREMENT PRIMARY KEY,</w:t>
+      </w:r>
+    </w:p>
+    <w:p>
+      <w:pPr>
+        <w:rPr>
+          <w:rFonts w:hint="default"/>
+        </w:rPr>
+      </w:pPr>
+      <w:r>
+        <w:rPr>
+          <w:rFonts w:hint="default"/>
+        </w:rPr>
+        <w:t xml:space="preserve">    product_id INT NOT NULL,</w:t>
+      </w:r>
+    </w:p>
+    <w:p>
+      <w:pPr>
+        <w:rPr>
+          <w:rFonts w:hint="default"/>
+        </w:rPr>
+      </w:pPr>
+      <w:r>
+        <w:rPr>
+          <w:rFonts w:hint="default"/>
+        </w:rPr>
+        <w:t xml:space="preserve">    title VARCHAR(255) DEFAULT NULL,</w:t>
+      </w:r>
+    </w:p>
+    <w:p>
+      <w:pPr>
+        <w:rPr>
+          <w:rFonts w:hint="default"/>
+        </w:rPr>
+      </w:pPr>
+      <w:r>
+        <w:rPr>
+          <w:rFonts w:hint="default"/>
+        </w:rPr>
+        <w:t xml:space="preserve">    content TEXT NOT NULL,</w:t>
+      </w:r>
+    </w:p>
+    <w:p>
+      <w:pPr>
+        <w:rPr>
+          <w:rFonts w:hint="default"/>
+        </w:rPr>
+      </w:pPr>
+      <w:r>
+        <w:rPr>
+          <w:rFonts w:hint="default"/>
+        </w:rPr>
+        <w:t xml:space="preserve">    created_at TIMESTAMP DEFAULT CURRENT_TIMESTAMP,</w:t>
+      </w:r>
+    </w:p>
+    <w:p>
+      <w:pPr>
+        <w:rPr>
+          <w:rFonts w:hint="default"/>
+        </w:rPr>
+      </w:pPr>
+      <w:r>
+        <w:rPr>
+          <w:rFonts w:hint="default"/>
+        </w:rPr>
+        <w:t xml:space="preserve">    </w:t>
+      </w:r>
+    </w:p>
+    <w:p>
+      <w:pPr>
+        <w:rPr>
+          <w:rFonts w:hint="default"/>
+        </w:rPr>
+      </w:pPr>
+      <w:r>
+        <w:rPr>
+          <w:rFonts w:hint="default"/>
+        </w:rPr>
+        <w:t xml:space="preserve">    CONSTRAINT fk_description_product FOREIGN KEY (product_id) REFERENCES products(id) ON DELETE CASCADE</w:t>
+      </w:r>
+    </w:p>
+    <w:p>
+      <w:pPr>
+        <w:rPr>
+          <w:rFonts w:hint="default"/>
+        </w:rPr>
+      </w:pPr>
+      <w:r>
+        <w:rPr>
+          <w:rFonts w:hint="default"/>
+        </w:rPr>
+        <w:t>);</w:t>
+      </w:r>
+    </w:p>
+    <w:p>
+      <w:pPr>
+        <w:rPr>
+          <w:rFonts w:hint="default"/>
+        </w:rPr>
+      </w:pPr>
+    </w:p>
+    <w:p>
+      <w:pPr>
+        <w:rPr>
+          <w:rFonts w:hint="default"/>
+        </w:rPr>
+      </w:pPr>
+      <w:r>
+        <w:rPr>
+          <w:rFonts w:hint="default"/>
+        </w:rPr>
+        <w:t>-- 8. Tạo bảng product_variants (Phân loại như Màu sắc, Kích thước)</w:t>
+      </w:r>
+    </w:p>
+    <w:p>
+      <w:pPr>
+        <w:rPr>
+          <w:rFonts w:hint="default"/>
+        </w:rPr>
+      </w:pPr>
+      <w:r>
+        <w:rPr>
+          <w:rFonts w:hint="default"/>
+        </w:rPr>
+        <w:t>CREATE TABLE product_variants (</w:t>
+      </w:r>
+    </w:p>
+    <w:p>
+      <w:pPr>
+        <w:rPr>
+          <w:rFonts w:hint="default"/>
+        </w:rPr>
+      </w:pPr>
+      <w:r>
+        <w:rPr>
+          <w:rFonts w:hint="default"/>
+        </w:rPr>
+        <w:t xml:space="preserve">    id INT AUTO_INCREMENT PRIMARY KEY,</w:t>
+      </w:r>
+    </w:p>
+    <w:p>
+      <w:pPr>
+        <w:rPr>
+          <w:rFonts w:hint="default"/>
+        </w:rPr>
+      </w:pPr>
+      <w:r>
+        <w:rPr>
+          <w:rFonts w:hint="default"/>
+        </w:rPr>
+        <w:t xml:space="preserve">    product_id INT NOT NULL,</w:t>
+      </w:r>
+    </w:p>
+    <w:p>
+      <w:pPr>
+        <w:rPr>
+          <w:rFonts w:hint="default"/>
+        </w:rPr>
+      </w:pPr>
+      <w:r>
+        <w:rPr>
+          <w:rFonts w:hint="default"/>
+        </w:rPr>
+        <w:t xml:space="preserve">    variant_name VARCHAR(100) NOT NULL COMMENT 'Ví dụ: Màu sắc, Size',</w:t>
+      </w:r>
+    </w:p>
+    <w:p>
+      <w:pPr>
+        <w:rPr>
+          <w:rFonts w:hint="default"/>
+        </w:rPr>
+      </w:pPr>
+      <w:r>
+        <w:rPr>
+          <w:rFonts w:hint="default"/>
+        </w:rPr>
+        <w:t xml:space="preserve">    variant_value VARCHAR(100) NOT NULL COMMENT 'Ví dụ: Đỏ, XL',</w:t>
+      </w:r>
+    </w:p>
+    <w:p>
+      <w:pPr>
+        <w:rPr>
+          <w:rFonts w:hint="default"/>
+        </w:rPr>
+      </w:pPr>
+      <w:r>
+        <w:rPr>
+          <w:rFonts w:hint="default"/>
+        </w:rPr>
+        <w:t xml:space="preserve">    price DECIMAL(15, 2) NOT NULL DEFAULT 0.00,</w:t>
+      </w:r>
+    </w:p>
+    <w:p>
+      <w:pPr>
+        <w:rPr>
+          <w:rFonts w:hint="default"/>
+        </w:rPr>
+      </w:pPr>
+      <w:r>
+        <w:rPr>
+          <w:rFonts w:hint="default"/>
+        </w:rPr>
+        <w:t xml:space="preserve">    quantity INT NOT NULL DEFAULT 0,</w:t>
+      </w:r>
+    </w:p>
+    <w:p>
+      <w:pPr>
+        <w:rPr>
+          <w:rFonts w:hint="default"/>
+        </w:rPr>
+      </w:pPr>
+      <w:r>
+        <w:rPr>
+          <w:rFonts w:hint="default"/>
+        </w:rPr>
+        <w:t xml:space="preserve">    discount DECIMAL(5, 2) DEFAULT 0.00 COMMENT 'Phần trăm giảm giá',</w:t>
+      </w:r>
+    </w:p>
+    <w:p>
+      <w:pPr>
+        <w:rPr>
+          <w:rFonts w:hint="default"/>
+        </w:rPr>
+      </w:pPr>
+      <w:r>
+        <w:rPr>
+          <w:rFonts w:hint="default"/>
+        </w:rPr>
+        <w:t xml:space="preserve">    level TINYINT DEFAULT 1 COMMENT 'Cấp độ ưu tiên hiển thị',</w:t>
+      </w:r>
+    </w:p>
+    <w:p>
+      <w:pPr>
+        <w:rPr>
+          <w:rFonts w:hint="default"/>
+        </w:rPr>
+      </w:pPr>
+      <w:r>
+        <w:rPr>
+          <w:rFonts w:hint="default"/>
+        </w:rPr>
+        <w:t xml:space="preserve">    created_at TIMESTAMP DEFAULT CURRENT_TIMESTAMP,</w:t>
+      </w:r>
+    </w:p>
+    <w:p>
+      <w:pPr>
+        <w:rPr>
+          <w:rFonts w:hint="default"/>
+        </w:rPr>
+      </w:pPr>
+      <w:r>
+        <w:rPr>
+          <w:rFonts w:hint="default"/>
+        </w:rPr>
+        <w:t xml:space="preserve">    </w:t>
+      </w:r>
+    </w:p>
+    <w:p>
+      <w:pPr>
+        <w:rPr>
+          <w:rFonts w:hint="default"/>
+        </w:rPr>
+      </w:pPr>
+      <w:r>
+        <w:rPr>
+          <w:rFonts w:hint="default"/>
+        </w:rPr>
+        <w:t xml:space="preserve">    CONSTRAINT fk_variant_product FOREIGN KEY (product_id) REFERENCES products(id) ON DELETE CASCADE</w:t>
+      </w:r>
+    </w:p>
+    <w:p>
+      <w:pPr>
+        <w:rPr>
+          <w:rFonts w:hint="default"/>
+        </w:rPr>
+      </w:pPr>
       <w:r>
         <w:rPr>
           <w:rFonts w:hint="default"/>
@@ -700,7 +1442,7 @@
   <w:docDefaults>
     <w:rPrDefault>
       <w:rPr>
-        <w:rFonts w:asciiTheme="minorHAnsi" w:hAnsiTheme="minorHAnsi" w:eastAsiaTheme="minorEastAsia" w:cstheme="minorBidi"/>
+        <w:rFonts w:ascii="Times New Roman" w:hAnsi="Times New Roman" w:eastAsia="SimSun" w:cs="Times New Roman"/>
       </w:rPr>
     </w:rPrDefault>
     <w:pPrDefault/>
@@ -744,12 +1486,12 @@
     <w:lsdException w:qFormat="1" w:unhideWhenUsed="0" w:uiPriority="0" w:semiHidden="0" w:name="table of figures"/>
     <w:lsdException w:qFormat="1" w:unhideWhenUsed="0" w:uiPriority="0" w:semiHidden="0" w:name="envelope address"/>
     <w:lsdException w:qFormat="1" w:unhideWhenUsed="0" w:uiPriority="0" w:semiHidden="0" w:name="envelope return"/>
-    <w:lsdException w:unhideWhenUsed="0" w:uiPriority="0" w:semiHidden="0" w:name="footnote reference"/>
+    <w:lsdException w:qFormat="1" w:unhideWhenUsed="0" w:uiPriority="0" w:semiHidden="0" w:name="footnote reference"/>
     <w:lsdException w:qFormat="1" w:unhideWhenUsed="0" w:uiPriority="0" w:semiHidden="0" w:name="annotation reference"/>
     <w:lsdException w:qFormat="1" w:unhideWhenUsed="0" w:uiPriority="0" w:semiHidden="0" w:name="line number"/>
     <w:lsdException w:unhideWhenUsed="0" w:uiPriority="0" w:semiHidden="0" w:name="page number"/>
     <w:lsdException w:qFormat="1" w:unhideWhenUsed="0" w:uiPriority="0" w:semiHidden="0" w:name="endnote reference"/>
-    <w:lsdException w:unhideWhenUsed="0" w:uiPriority="0" w:semiHidden="0" w:name="endnote text"/>
+    <w:lsdException w:qFormat="1" w:unhideWhenUsed="0" w:uiPriority="0" w:semiHidden="0" w:name="endnote text"/>
     <w:lsdException w:qFormat="1" w:unhideWhenUsed="0" w:uiPriority="0" w:semiHidden="0" w:name="table of authorities"/>
     <w:lsdException w:qFormat="1" w:unhideWhenUsed="0" w:uiPriority="0" w:semiHidden="0" w:name="macro"/>
     <w:lsdException w:qFormat="1" w:unhideWhenUsed="0" w:uiPriority="0" w:semiHidden="0" w:name="toa heading"/>
@@ -761,8 +1503,8 @@
     <w:lsdException w:qFormat="1" w:unhideWhenUsed="0" w:uiPriority="0" w:semiHidden="0" w:name="List 4"/>
     <w:lsdException w:unhideWhenUsed="0" w:uiPriority="0" w:semiHidden="0" w:name="List 5"/>
     <w:lsdException w:qFormat="1" w:unhideWhenUsed="0" w:uiPriority="0" w:semiHidden="0" w:name="List Bullet 2"/>
-    <w:lsdException w:unhideWhenUsed="0" w:uiPriority="0" w:semiHidden="0" w:name="List Bullet 3"/>
-    <w:lsdException w:unhideWhenUsed="0" w:uiPriority="0" w:semiHidden="0" w:name="List Bullet 4"/>
+    <w:lsdException w:qFormat="1" w:unhideWhenUsed="0" w:uiPriority="0" w:semiHidden="0" w:name="List Bullet 3"/>
+    <w:lsdException w:qFormat="1" w:unhideWhenUsed="0" w:uiPriority="0" w:semiHidden="0" w:name="List Bullet 4"/>
     <w:lsdException w:unhideWhenUsed="0" w:uiPriority="0" w:semiHidden="0" w:name="List Bullet 5"/>
     <w:lsdException w:qFormat="1" w:unhideWhenUsed="0" w:uiPriority="0" w:semiHidden="0" w:name="List Number 2"/>
     <w:lsdException w:qFormat="1" w:unhideWhenUsed="0" w:uiPriority="0" w:semiHidden="0" w:name="List Number 3"/>
@@ -772,7 +1514,7 @@
     <w:lsdException w:qFormat="1" w:unhideWhenUsed="0" w:uiPriority="0" w:semiHidden="0" w:name="Closing"/>
     <w:lsdException w:qFormat="1" w:unhideWhenUsed="0" w:uiPriority="0" w:semiHidden="0" w:name="Signature"/>
     <w:lsdException w:qFormat="1" w:unhideWhenUsed="0" w:uiPriority="0" w:name="Default Paragraph Font"/>
-    <w:lsdException w:unhideWhenUsed="0" w:uiPriority="0" w:semiHidden="0" w:name="Body Text"/>
+    <w:lsdException w:qFormat="1" w:unhideWhenUsed="0" w:uiPriority="0" w:semiHidden="0" w:name="Body Text"/>
     <w:lsdException w:unhideWhenUsed="0" w:uiPriority="0" w:semiHidden="0" w:name="Body Text Indent"/>
     <w:lsdException w:qFormat="1" w:unhideWhenUsed="0" w:uiPriority="0" w:semiHidden="0" w:name="List Continue"/>
     <w:lsdException w:qFormat="1" w:unhideWhenUsed="0" w:uiPriority="0" w:semiHidden="0" w:name="List Continue 2"/>
@@ -783,10 +1525,10 @@
     <w:lsdException w:qFormat="1" w:unhideWhenUsed="0" w:uiPriority="0" w:semiHidden="0" w:name="Subtitle"/>
     <w:lsdException w:qFormat="1" w:unhideWhenUsed="0" w:uiPriority="0" w:semiHidden="0" w:name="Salutation"/>
     <w:lsdException w:qFormat="1" w:unhideWhenUsed="0" w:uiPriority="0" w:semiHidden="0" w:name="Date"/>
-    <w:lsdException w:unhideWhenUsed="0" w:uiPriority="0" w:semiHidden="0" w:name="Body Text First Indent"/>
+    <w:lsdException w:qFormat="1" w:unhideWhenUsed="0" w:uiPriority="0" w:semiHidden="0" w:name="Body Text First Indent"/>
     <w:lsdException w:qFormat="1" w:unhideWhenUsed="0" w:uiPriority="0" w:semiHidden="0" w:name="Body Text First Indent 2"/>
     <w:lsdException w:qFormat="1" w:unhideWhenUsed="0" w:uiPriority="0" w:semiHidden="0" w:name="Note Heading"/>
-    <w:lsdException w:unhideWhenUsed="0" w:uiPriority="0" w:semiHidden="0" w:name="Body Text 2"/>
+    <w:lsdException w:qFormat="1" w:unhideWhenUsed="0" w:uiPriority="0" w:semiHidden="0" w:name="Body Text 2"/>
     <w:lsdException w:qFormat="1" w:unhideWhenUsed="0" w:uiPriority="0" w:semiHidden="0" w:name="Body Text 3"/>
     <w:lsdException w:qFormat="1" w:unhideWhenUsed="0" w:uiPriority="0" w:semiHidden="0" w:name="Body Text Indent 2"/>
     <w:lsdException w:qFormat="1" w:unhideWhenUsed="0" w:uiPriority="0" w:semiHidden="0" w:name="Body Text Indent 3"/>
@@ -805,12 +1547,12 @@
     <w:lsdException w:qFormat="1" w:unhideWhenUsed="0" w:uiPriority="0" w:semiHidden="0" w:name="HTML Code"/>
     <w:lsdException w:qFormat="1" w:unhideWhenUsed="0" w:uiPriority="0" w:semiHidden="0" w:name="HTML Definition"/>
     <w:lsdException w:qFormat="1" w:unhideWhenUsed="0" w:uiPriority="0" w:semiHidden="0" w:name="HTML Keyboard"/>
-    <w:lsdException w:unhideWhenUsed="0" w:uiPriority="0" w:semiHidden="0" w:name="HTML Preformatted"/>
-    <w:lsdException w:unhideWhenUsed="0" w:uiPriority="0" w:semiHidden="0" w:name="HTML Sample"/>
+    <w:lsdException w:qFormat="1" w:unhideWhenUsed="0" w:uiPriority="0" w:semiHidden="0" w:name="HTML Preformatted"/>
+    <w:lsdException w:qFormat="1" w:unhideWhenUsed="0" w:uiPriority="0" w:semiHidden="0" w:name="HTML Sample"/>
     <w:lsdException w:qFormat="1" w:unhideWhenUsed="0" w:uiPriority="0" w:semiHidden="0" w:name="HTML Typewriter"/>
     <w:lsdException w:qFormat="1" w:unhideWhenUsed="0" w:uiPriority="0" w:semiHidden="0" w:name="HTML Variable"/>
     <w:lsdException w:qFormat="1" w:unhideWhenUsed="0" w:uiPriority="0" w:name="Normal Table"/>
-    <w:lsdException w:unhideWhenUsed="0" w:uiPriority="0" w:semiHidden="0" w:name="annotation subject"/>
+    <w:lsdException w:qFormat="1" w:unhideWhenUsed="0" w:uiPriority="0" w:semiHidden="0" w:name="annotation subject"/>
     <w:lsdException w:qFormat="1" w:unhideWhenUsed="0" w:uiPriority="0" w:semiHidden="0" w:name="Table Simple 1"/>
     <w:lsdException w:qFormat="1" w:unhideWhenUsed="0" w:uiPriority="0" w:semiHidden="0" w:name="Table Simple 2"/>
     <w:lsdException w:qFormat="1" w:unhideWhenUsed="0" w:uiPriority="0" w:semiHidden="0" w:name="Table Simple 3"/>
@@ -834,19 +1576,19 @@
     <w:lsdException w:unhideWhenUsed="0" w:uiPriority="0" w:semiHidden="0" w:name="Table Grid 6"/>
     <w:lsdException w:unhideWhenUsed="0" w:uiPriority="0" w:semiHidden="0" w:name="Table Grid 7"/>
     <w:lsdException w:unhideWhenUsed="0" w:uiPriority="0" w:semiHidden="0" w:name="Table Grid 8"/>
-    <w:lsdException w:unhideWhenUsed="0" w:uiPriority="0" w:semiHidden="0" w:name="Table List 1"/>
+    <w:lsdException w:qFormat="1" w:unhideWhenUsed="0" w:uiPriority="0" w:semiHidden="0" w:name="Table List 1"/>
     <w:lsdException w:unhideWhenUsed="0" w:uiPriority="0" w:semiHidden="0" w:name="Table List 2"/>
     <w:lsdException w:unhideWhenUsed="0" w:uiPriority="0" w:semiHidden="0" w:name="Table List 3"/>
     <w:lsdException w:unhideWhenUsed="0" w:uiPriority="0" w:semiHidden="0" w:name="Table List 4"/>
-    <w:lsdException w:unhideWhenUsed="0" w:uiPriority="0" w:semiHidden="0" w:name="Table List 5"/>
+    <w:lsdException w:qFormat="1" w:unhideWhenUsed="0" w:uiPriority="0" w:semiHidden="0" w:name="Table List 5"/>
     <w:lsdException w:unhideWhenUsed="0" w:uiPriority="0" w:semiHidden="0" w:name="Table List 6"/>
     <w:lsdException w:unhideWhenUsed="0" w:uiPriority="0" w:semiHidden="0" w:name="Table List 7"/>
     <w:lsdException w:qFormat="1" w:unhideWhenUsed="0" w:uiPriority="0" w:semiHidden="0" w:name="Table List 8"/>
     <w:lsdException w:qFormat="1" w:unhideWhenUsed="0" w:uiPriority="0" w:semiHidden="0" w:name="Table 3D effects 1"/>
-    <w:lsdException w:unhideWhenUsed="0" w:uiPriority="0" w:semiHidden="0" w:name="Table 3D effects 2"/>
+    <w:lsdException w:qFormat="1" w:unhideWhenUsed="0" w:uiPriority="0" w:semiHidden="0" w:name="Table 3D effects 2"/>
     <w:lsdException w:qFormat="1" w:unhideWhenUsed="0" w:uiPriority="0" w:semiHidden="0" w:name="Table 3D effects 3"/>
     <w:lsdException w:unhideWhenUsed="0" w:uiPriority="0" w:semiHidden="0" w:name="Table Contemporary"/>
-    <w:lsdException w:unhideWhenUsed="0" w:uiPriority="0" w:semiHidden="0" w:name="Table Elegant"/>
+    <w:lsdException w:qFormat="1" w:unhideWhenUsed="0" w:uiPriority="0" w:semiHidden="0" w:name="Table Elegant"/>
     <w:lsdException w:unhideWhenUsed="0" w:uiPriority="0" w:semiHidden="0" w:name="Table Professional"/>
     <w:lsdException w:qFormat="1" w:unhideWhenUsed="0" w:uiPriority="0" w:semiHidden="0" w:name="Table Subtle 1"/>
     <w:lsdException w:qFormat="1" w:unhideWhenUsed="0" w:uiPriority="0" w:semiHidden="0" w:name="Table Subtle 2"/>
@@ -895,7 +1637,7 @@
     <w:lsdException w:unhideWhenUsed="0" w:uiPriority="68" w:semiHidden="0" w:name="Medium Grid 2 Accent 2"/>
     <w:lsdException w:unhideWhenUsed="0" w:uiPriority="69" w:semiHidden="0" w:name="Medium Grid 3 Accent 2"/>
     <w:lsdException w:qFormat="1" w:unhideWhenUsed="0" w:uiPriority="70" w:semiHidden="0" w:name="Dark List Accent 2"/>
-    <w:lsdException w:unhideWhenUsed="0" w:uiPriority="71" w:semiHidden="0" w:name="Colorful Shading Accent 2"/>
+    <w:lsdException w:qFormat="1" w:unhideWhenUsed="0" w:uiPriority="71" w:semiHidden="0" w:name="Colorful Shading Accent 2"/>
     <w:lsdException w:unhideWhenUsed="0" w:uiPriority="72" w:semiHidden="0" w:name="Colorful List Accent 2"/>
     <w:lsdException w:unhideWhenUsed="0" w:uiPriority="73" w:semiHidden="0" w:name="Colorful Grid Accent 2"/>
     <w:lsdException w:unhideWhenUsed="0" w:uiPriority="60" w:semiHidden="0" w:name="Light Shading Accent 3"/>
@@ -923,7 +1665,7 @@
     <w:lsdException w:qFormat="1" w:unhideWhenUsed="0" w:uiPriority="68" w:semiHidden="0" w:name="Medium Grid 2 Accent 4"/>
     <w:lsdException w:unhideWhenUsed="0" w:uiPriority="69" w:semiHidden="0" w:name="Medium Grid 3 Accent 4"/>
     <w:lsdException w:qFormat="1" w:unhideWhenUsed="0" w:uiPriority="70" w:semiHidden="0" w:name="Dark List Accent 4"/>
-    <w:lsdException w:unhideWhenUsed="0" w:uiPriority="71" w:semiHidden="0" w:name="Colorful Shading Accent 4"/>
+    <w:lsdException w:qFormat="1" w:unhideWhenUsed="0" w:uiPriority="71" w:semiHidden="0" w:name="Colorful Shading Accent 4"/>
     <w:lsdException w:unhideWhenUsed="0" w:uiPriority="72" w:semiHidden="0" w:name="Colorful List Accent 4"/>
     <w:lsdException w:unhideWhenUsed="0" w:uiPriority="73" w:semiHidden="0" w:name="Colorful Grid Accent 4"/>
     <w:lsdException w:qFormat="1" w:unhideWhenUsed="0" w:uiPriority="60" w:semiHidden="0" w:name="Light Shading Accent 5"/>
@@ -1191,6 +1933,7 @@
   <w:style w:type="paragraph" w:styleId="15">
     <w:name w:val="Body Text"/>
     <w:basedOn w:val="1"/>
+    <w:qFormat/>
     <w:uiPriority w:val="0"/>
     <w:pPr>
       <w:spacing w:after="120"/>
@@ -1199,6 +1942,7 @@
   <w:style w:type="paragraph" w:styleId="16">
     <w:name w:val="Body Text 2"/>
     <w:basedOn w:val="1"/>
+    <w:qFormat/>
     <w:uiPriority w:val="0"/>
     <w:pPr>
       <w:spacing w:after="120" w:line="480" w:lineRule="auto"/>
@@ -1220,6 +1964,7 @@
   <w:style w:type="paragraph" w:styleId="18">
     <w:name w:val="Body Text First Indent"/>
     <w:basedOn w:val="15"/>
+    <w:qFormat/>
     <w:uiPriority w:val="0"/>
     <w:pPr>
       <w:ind w:firstLine="420" w:firstLineChars="100"/>
@@ -1312,6 +2057,7 @@
     <w:name w:val="annotation subject"/>
     <w:basedOn w:val="26"/>
     <w:next w:val="26"/>
+    <w:qFormat/>
     <w:uiPriority w:val="0"/>
     <w:rPr>
       <w:b/>
@@ -1365,6 +2111,7 @@
   <w:style w:type="paragraph" w:styleId="33">
     <w:name w:val="endnote text"/>
     <w:basedOn w:val="1"/>
+    <w:qFormat/>
     <w:uiPriority w:val="0"/>
     <w:pPr>
       <w:snapToGrid w:val="0"/>
@@ -1430,6 +2177,7 @@
   <w:style w:type="character" w:styleId="38">
     <w:name w:val="footnote reference"/>
     <w:basedOn w:val="11"/>
+    <w:qFormat/>
     <w:uiPriority w:val="0"/>
     <w:rPr>
       <w:vertAlign w:val="superscript"/>
@@ -1527,6 +2275,7 @@
   <w:style w:type="paragraph" w:styleId="47">
     <w:name w:val="HTML Preformatted"/>
     <w:basedOn w:val="1"/>
+    <w:qFormat/>
     <w:uiPriority w:val="0"/>
     <w:rPr>
       <w:rFonts w:ascii="Courier New" w:hAnsi="Courier New" w:cs="Courier New"/>
@@ -1536,6 +2285,7 @@
   <w:style w:type="character" w:styleId="48">
     <w:name w:val="HTML Sample"/>
     <w:basedOn w:val="11"/>
+    <w:qFormat/>
     <w:uiPriority w:val="0"/>
     <w:rPr>
       <w:rFonts w:ascii="Courier New" w:hAnsi="Courier New" w:cs="Courier New"/>
@@ -1744,6 +2494,7 @@
   <w:style w:type="paragraph" w:styleId="70">
     <w:name w:val="List Bullet 3"/>
     <w:basedOn w:val="1"/>
+    <w:qFormat/>
     <w:uiPriority w:val="0"/>
     <w:pPr>
       <w:numPr>
@@ -1755,6 +2506,7 @@
   <w:style w:type="paragraph" w:styleId="71">
     <w:name w:val="List Bullet 4"/>
     <w:basedOn w:val="1"/>
+    <w:qFormat/>
     <w:uiPriority w:val="0"/>
     <w:pPr>
       <w:numPr>
@@ -2138,6 +2890,7 @@
   <w:style w:type="table" w:styleId="95">
     <w:name w:val="Table 3D effects 2"/>
     <w:basedOn w:val="12"/>
+    <w:qFormat/>
     <w:uiPriority w:val="0"/>
     <w:pPr>
       <w:widowControl w:val="0"/>
@@ -3409,6 +4162,7 @@
   <w:style w:type="table" w:styleId="110">
     <w:name w:val="Table Elegant"/>
     <w:basedOn w:val="12"/>
+    <w:qFormat/>
     <w:uiPriority w:val="0"/>
     <w:pPr>
       <w:widowControl w:val="0"/>
@@ -4013,6 +4767,7 @@
   <w:style w:type="table" w:styleId="120">
     <w:name w:val="Table List 1"/>
     <w:basedOn w:val="12"/>
+    <w:qFormat/>
     <w:uiPriority w:val="0"/>
     <w:pPr>
       <w:widowControl w:val="0"/>
@@ -4269,6 +5024,7 @@
   <w:style w:type="table" w:styleId="124">
     <w:name w:val="Table List 5"/>
     <w:basedOn w:val="12"/>
+    <w:qFormat/>
     <w:uiPriority w:val="0"/>
     <w:pPr>
       <w:widowControl w:val="0"/>
@@ -13218,6 +13974,7 @@
   <w:style w:type="table" w:styleId="230">
     <w:name w:val="Colorful Shading Accent 2"/>
     <w:basedOn w:val="12"/>
+    <w:qFormat/>
     <w:uiPriority w:val="71"/>
     <w:rPr>
       <w:color w:val="000000"/>
@@ -13426,6 +14183,7 @@
   <w:style w:type="table" w:styleId="232">
     <w:name w:val="Colorful Shading Accent 4"/>
     <w:basedOn w:val="12"/>
+    <w:qFormat/>
     <w:uiPriority w:val="71"/>
     <w:rPr>
       <w:color w:val="000000"/>

</xml_diff>

<commit_message>
Api Order, UI Checkout, OrderDetail
</commit_message>
<xml_diff>
--- a/tmdt.docx
+++ b/tmdt.docx
@@ -1481,8 +1481,622 @@
         </w:rPr>
         <w:t>);</w:t>
       </w:r>
+    </w:p>
+    <w:p>
+      <w:pPr>
+        <w:rPr>
+          <w:rFonts w:hint="default"/>
+          <w:lang w:val="en-US"/>
+        </w:rPr>
+      </w:pPr>
+      <w:r>
+        <w:rPr>
+          <w:rFonts w:hint="default"/>
+        </w:rPr>
+        <w:br w:type="textWrapping"/>
+      </w:r>
+      <w:r>
+        <w:rPr>
+          <w:rFonts w:hint="default"/>
+        </w:rPr>
+        <w:t xml:space="preserve">- </w:t>
+      </w:r>
+      <w:r>
+        <w:rPr>
+          <w:rFonts w:hint="default"/>
+          <w:lang w:val="en-US"/>
+        </w:rPr>
+        <w:t>10</w:t>
+      </w:r>
+      <w:r>
+        <w:rPr>
+          <w:rFonts w:hint="default"/>
+        </w:rPr>
+        <w:t xml:space="preserve">. Tạo bảng </w:t>
+      </w:r>
+      <w:r>
+        <w:rPr>
+          <w:rFonts w:hint="default"/>
+          <w:lang w:val="en-US"/>
+        </w:rPr>
+        <w:t>orders</w:t>
+      </w:r>
+    </w:p>
+    <w:p>
+      <w:pPr>
+        <w:rPr>
+          <w:rFonts w:hint="default"/>
+        </w:rPr>
+      </w:pPr>
+      <w:r>
+        <w:rPr>
+          <w:rFonts w:hint="default"/>
+        </w:rPr>
+        <w:t>CREATE TABLE orders (</w:t>
+      </w:r>
+    </w:p>
+    <w:p>
+      <w:pPr>
+        <w:rPr>
+          <w:rFonts w:hint="default"/>
+        </w:rPr>
+      </w:pPr>
+      <w:r>
+        <w:rPr>
+          <w:rFonts w:hint="default"/>
+        </w:rPr>
+        <w:t xml:space="preserve">    id INT AUTO_INCREMENT PRIMARY KEY,</w:t>
+      </w:r>
+    </w:p>
+    <w:p>
+      <w:pPr>
+        <w:rPr>
+          <w:rFonts w:hint="default"/>
+        </w:rPr>
+      </w:pPr>
+      <w:r>
+        <w:rPr>
+          <w:rFonts w:hint="default"/>
+        </w:rPr>
+        <w:t xml:space="preserve">    user_id INT NULL, -- Để NULL để khi user bị xóa, đơn hàng vẫn còn</w:t>
+      </w:r>
+    </w:p>
+    <w:p>
+      <w:pPr>
+        <w:rPr>
+          <w:rFonts w:hint="default"/>
+        </w:rPr>
+      </w:pPr>
+      <w:r>
+        <w:rPr>
+          <w:rFonts w:hint="default"/>
+        </w:rPr>
+        <w:t xml:space="preserve">    name VARCHAR(255) NOT NULL COMMENT 'Tên người nhận',</w:t>
+      </w:r>
+    </w:p>
+    <w:p>
+      <w:pPr>
+        <w:rPr>
+          <w:rFonts w:hint="default"/>
+        </w:rPr>
+      </w:pPr>
+      <w:r>
+        <w:rPr>
+          <w:rFonts w:hint="default"/>
+        </w:rPr>
+        <w:t xml:space="preserve">    address TEXT NOT NULL COMMENT 'Địa chỉ nhận hàng',</w:t>
+      </w:r>
+    </w:p>
+    <w:p>
+      <w:pPr>
+        <w:rPr>
+          <w:rFonts w:hint="default"/>
+        </w:rPr>
+      </w:pPr>
+      <w:r>
+        <w:rPr>
+          <w:rFonts w:hint="default"/>
+        </w:rPr>
+        <w:t xml:space="preserve">    positioning VARCHAR(255) DEFAULT NULL COMMENT 'Toạ độ hoặc định vị GPS',</w:t>
+      </w:r>
+    </w:p>
+    <w:p>
+      <w:pPr>
+        <w:rPr>
+          <w:rFonts w:hint="default"/>
+        </w:rPr>
+      </w:pPr>
+      <w:r>
+        <w:rPr>
+          <w:rFonts w:hint="default"/>
+        </w:rPr>
+        <w:t xml:space="preserve">    phone VARCHAR(20) NOT NULL,</w:t>
+      </w:r>
+    </w:p>
+    <w:p>
+      <w:pPr>
+        <w:rPr>
+          <w:rFonts w:hint="default"/>
+        </w:rPr>
+      </w:pPr>
+      <w:r>
+        <w:rPr>
+          <w:rFonts w:hint="default"/>
+        </w:rPr>
+        <w:t xml:space="preserve">    total_price DECIMAL(15, 2) NOT NULL DEFAULT 0.00,</w:t>
+      </w:r>
+    </w:p>
+    <w:p>
+      <w:pPr>
+        <w:rPr>
+          <w:rFonts w:hint="default"/>
+        </w:rPr>
+      </w:pPr>
+      <w:r>
+        <w:rPr>
+          <w:rFonts w:hint="default"/>
+        </w:rPr>
+        <w:t xml:space="preserve">    ship_price DECIMAL(15, 2) NOT NULL DEFAULT 0.00,</w:t>
+      </w:r>
+    </w:p>
+    <w:p>
+      <w:pPr>
+        <w:rPr>
+          <w:rFonts w:hint="default"/>
+        </w:rPr>
+      </w:pPr>
+      <w:r>
+        <w:rPr>
+          <w:rFonts w:hint="default"/>
+        </w:rPr>
+        <w:t xml:space="preserve">    payment_method TINYINT DEFAULT 0 COMMENT '0: COD, 1: Online',</w:t>
+      </w:r>
+    </w:p>
+    <w:p>
+      <w:pPr>
+        <w:rPr>
+          <w:rFonts w:hint="default"/>
+        </w:rPr>
+      </w:pPr>
+      <w:r>
+        <w:rPr>
+          <w:rFonts w:hint="default"/>
+        </w:rPr>
+        <w:t xml:space="preserve">    payment_status TINYINT DEFAULT 0 COMMENT '0: Chưa thanh toán, 1: Thành công',</w:t>
+      </w:r>
+    </w:p>
+    <w:p>
+      <w:pPr>
+        <w:rPr>
+          <w:rFonts w:hint="default"/>
+        </w:rPr>
+      </w:pPr>
+      <w:r>
+        <w:rPr>
+          <w:rFonts w:hint="default"/>
+        </w:rPr>
+        <w:t xml:space="preserve">    status TINYINT DEFAULT 0 COMMENT '0: Thành công, 1: Chuẩn bị, 2: Giao hàng, 3: Hoàn thành',</w:t>
+      </w:r>
+    </w:p>
+    <w:p>
+      <w:pPr>
+        <w:rPr>
+          <w:rFonts w:hint="default"/>
+        </w:rPr>
+      </w:pPr>
+      <w:r>
+        <w:rPr>
+          <w:rFonts w:hint="default"/>
+        </w:rPr>
+        <w:t xml:space="preserve">    </w:t>
+      </w:r>
+    </w:p>
+    <w:p>
+      <w:pPr>
+        <w:rPr>
+          <w:rFonts w:hint="default"/>
+        </w:rPr>
+      </w:pPr>
+      <w:r>
+        <w:rPr>
+          <w:rFonts w:hint="default"/>
+        </w:rPr>
+        <w:t xml:space="preserve">    created_at TIMESTAMP DEFAULT CURRENT_TIMESTAMP,</w:t>
+      </w:r>
+    </w:p>
+    <w:p>
+      <w:pPr>
+        <w:rPr>
+          <w:rFonts w:hint="default"/>
+        </w:rPr>
+      </w:pPr>
+      <w:r>
+        <w:rPr>
+          <w:rFonts w:hint="default"/>
+        </w:rPr>
+        <w:t xml:space="preserve">    updated_at TIMESTAMP DEFAULT CURRENT_TIMESTAMP ON UPDATE CURRENT_TIMESTAMP,</w:t>
+      </w:r>
+    </w:p>
+    <w:p>
+      <w:pPr>
+        <w:rPr>
+          <w:rFonts w:hint="default"/>
+        </w:rPr>
+      </w:pPr>
+    </w:p>
+    <w:p>
+      <w:pPr>
+        <w:rPr>
+          <w:rFonts w:hint="default"/>
+        </w:rPr>
+      </w:pPr>
+      <w:r>
+        <w:rPr>
+          <w:rFonts w:hint="default"/>
+        </w:rPr>
+        <w:t xml:space="preserve">    -- Khóa ngoại: Nếu user bị xóa, user_id trong bảng này sẽ chuyển thành NULL</w:t>
+      </w:r>
+    </w:p>
+    <w:p>
+      <w:pPr>
+        <w:rPr>
+          <w:rFonts w:hint="default"/>
+        </w:rPr>
+      </w:pPr>
+      <w:r>
+        <w:rPr>
+          <w:rFonts w:hint="default"/>
+        </w:rPr>
+        <w:t xml:space="preserve">    CONSTRAINT fk_order_user FOREIGN KEY (user_id) </w:t>
+      </w:r>
+    </w:p>
+    <w:p>
+      <w:pPr>
+        <w:rPr>
+          <w:rFonts w:hint="default"/>
+        </w:rPr>
+      </w:pPr>
+      <w:r>
+        <w:rPr>
+          <w:rFonts w:hint="default"/>
+        </w:rPr>
+        <w:t xml:space="preserve">        REFERENCES users(id) ON DELETE SET NULL</w:t>
+      </w:r>
+    </w:p>
+    <w:p>
+      <w:pPr>
+        <w:rPr>
+          <w:rFonts w:hint="default"/>
+        </w:rPr>
+      </w:pPr>
+      <w:r>
+        <w:rPr>
+          <w:rFonts w:hint="default"/>
+        </w:rPr>
+        <w:t>);</w:t>
+      </w:r>
+    </w:p>
+    <w:p>
+      <w:pPr>
+        <w:rPr>
+          <w:rFonts w:hint="default"/>
+          <w:lang w:val="en-US"/>
+        </w:rPr>
+      </w:pPr>
+      <w:r>
+        <w:rPr>
+          <w:rFonts w:hint="default"/>
+        </w:rPr>
+        <w:br w:type="textWrapping"/>
+      </w:r>
+      <w:r>
+        <w:rPr>
+          <w:rFonts w:hint="default"/>
+        </w:rPr>
+        <w:t xml:space="preserve">- </w:t>
+      </w:r>
+      <w:r>
+        <w:rPr>
+          <w:rFonts w:hint="default"/>
+          <w:lang w:val="en-US"/>
+        </w:rPr>
+        <w:t>11</w:t>
+      </w:r>
+      <w:r>
+        <w:rPr>
+          <w:rFonts w:hint="default"/>
+        </w:rPr>
+        <w:t xml:space="preserve">. Tạo bảng </w:t>
+      </w:r>
+      <w:r>
+        <w:rPr>
+          <w:rFonts w:hint="default"/>
+          <w:lang w:val="en-US"/>
+        </w:rPr>
+        <w:t>order_items</w:t>
+      </w:r>
       <w:bookmarkStart w:id="0" w:name="_GoBack"/>
       <w:bookmarkEnd w:id="0"/>
+    </w:p>
+    <w:p>
+      <w:pPr>
+        <w:rPr>
+          <w:rFonts w:hint="default"/>
+        </w:rPr>
+      </w:pPr>
+      <w:r>
+        <w:rPr>
+          <w:rFonts w:hint="default"/>
+        </w:rPr>
+        <w:t>CREATE TABLE order_items (</w:t>
+      </w:r>
+    </w:p>
+    <w:p>
+      <w:pPr>
+        <w:rPr>
+          <w:rFonts w:hint="default"/>
+        </w:rPr>
+      </w:pPr>
+      <w:r>
+        <w:rPr>
+          <w:rFonts w:hint="default"/>
+        </w:rPr>
+        <w:t xml:space="preserve">    id INT AUTO_INCREMENT PRIMARY KEY,</w:t>
+      </w:r>
+    </w:p>
+    <w:p>
+      <w:pPr>
+        <w:rPr>
+          <w:rFonts w:hint="default"/>
+        </w:rPr>
+      </w:pPr>
+      <w:r>
+        <w:rPr>
+          <w:rFonts w:hint="default"/>
+        </w:rPr>
+        <w:t xml:space="preserve">    order_id INT NOT NULL,</w:t>
+      </w:r>
+    </w:p>
+    <w:p>
+      <w:pPr>
+        <w:rPr>
+          <w:rFonts w:hint="default"/>
+        </w:rPr>
+      </w:pPr>
+      <w:r>
+        <w:rPr>
+          <w:rFonts w:hint="default"/>
+        </w:rPr>
+        <w:t xml:space="preserve">    product_id INT NULL, -- Để NULL để giữ lại lịch sử nếu sản phẩm bị xóa</w:t>
+      </w:r>
+    </w:p>
+    <w:p>
+      <w:pPr>
+        <w:rPr>
+          <w:rFonts w:hint="default"/>
+        </w:rPr>
+      </w:pPr>
+      <w:r>
+        <w:rPr>
+          <w:rFonts w:hint="default"/>
+        </w:rPr>
+        <w:t xml:space="preserve">    variant_id INT NULL, -- Để NULL để giữ lại lịch sử nếu biến thể bị xóa</w:t>
+      </w:r>
+    </w:p>
+    <w:p>
+      <w:pPr>
+        <w:rPr>
+          <w:rFonts w:hint="default"/>
+        </w:rPr>
+      </w:pPr>
+      <w:r>
+        <w:rPr>
+          <w:rFonts w:hint="default"/>
+        </w:rPr>
+        <w:t xml:space="preserve">    price DECIMAL(15, 2) NOT NULL COMMENT 'Giá tại thời điểm mua',</w:t>
+      </w:r>
+    </w:p>
+    <w:p>
+      <w:pPr>
+        <w:rPr>
+          <w:rFonts w:hint="default"/>
+        </w:rPr>
+      </w:pPr>
+      <w:r>
+        <w:rPr>
+          <w:rFonts w:hint="default"/>
+        </w:rPr>
+        <w:t xml:space="preserve">    quantity INT NOT NULL DEFAULT 1,</w:t>
+      </w:r>
+    </w:p>
+    <w:p>
+      <w:pPr>
+        <w:rPr>
+          <w:rFonts w:hint="default"/>
+        </w:rPr>
+      </w:pPr>
+      <w:r>
+        <w:rPr>
+          <w:rFonts w:hint="default"/>
+        </w:rPr>
+        <w:t xml:space="preserve">    isReview TINYINT DEFAULT 0 COMMENT '0: Chưa review, 1: Đã review',</w:t>
+      </w:r>
+    </w:p>
+    <w:p>
+      <w:pPr>
+        <w:rPr>
+          <w:rFonts w:hint="default"/>
+        </w:rPr>
+      </w:pPr>
+      <w:r>
+        <w:rPr>
+          <w:rFonts w:hint="default"/>
+        </w:rPr>
+        <w:t xml:space="preserve">    </w:t>
+      </w:r>
+    </w:p>
+    <w:p>
+      <w:pPr>
+        <w:rPr>
+          <w:rFonts w:hint="default"/>
+        </w:rPr>
+      </w:pPr>
+      <w:r>
+        <w:rPr>
+          <w:rFonts w:hint="default"/>
+        </w:rPr>
+        <w:t xml:space="preserve">    created_at TIMESTAMP DEFAULT CURRENT_TIMESTAMP,</w:t>
+      </w:r>
+    </w:p>
+    <w:p>
+      <w:pPr>
+        <w:rPr>
+          <w:rFonts w:hint="default"/>
+        </w:rPr>
+      </w:pPr>
+    </w:p>
+    <w:p>
+      <w:pPr>
+        <w:rPr>
+          <w:rFonts w:hint="default"/>
+        </w:rPr>
+      </w:pPr>
+      <w:r>
+        <w:rPr>
+          <w:rFonts w:hint="default"/>
+        </w:rPr>
+        <w:t xml:space="preserve">    -- Khóa ngoại: Khi xóa đơn hàng (orders) thì chi tiết này mới bị xóa theo (CASCADE)</w:t>
+      </w:r>
+    </w:p>
+    <w:p>
+      <w:pPr>
+        <w:rPr>
+          <w:rFonts w:hint="default"/>
+        </w:rPr>
+      </w:pPr>
+      <w:r>
+        <w:rPr>
+          <w:rFonts w:hint="default"/>
+        </w:rPr>
+        <w:t xml:space="preserve">    CONSTRAINT fk_item_order FOREIGN KEY (order_id) </w:t>
+      </w:r>
+    </w:p>
+    <w:p>
+      <w:pPr>
+        <w:rPr>
+          <w:rFonts w:hint="default"/>
+        </w:rPr>
+      </w:pPr>
+      <w:r>
+        <w:rPr>
+          <w:rFonts w:hint="default"/>
+        </w:rPr>
+        <w:t xml:space="preserve">        REFERENCES orders(id) ON DELETE CASCADE,</w:t>
+      </w:r>
+    </w:p>
+    <w:p>
+      <w:pPr>
+        <w:rPr>
+          <w:rFonts w:hint="default"/>
+        </w:rPr>
+      </w:pPr>
+      <w:r>
+        <w:rPr>
+          <w:rFonts w:hint="default"/>
+        </w:rPr>
+        <w:t xml:space="preserve">        </w:t>
+      </w:r>
+    </w:p>
+    <w:p>
+      <w:pPr>
+        <w:rPr>
+          <w:rFonts w:hint="default"/>
+        </w:rPr>
+      </w:pPr>
+      <w:r>
+        <w:rPr>
+          <w:rFonts w:hint="default"/>
+        </w:rPr>
+        <w:t xml:space="preserve">    -- Khóa ngoại: Khi xóa sản phẩm/biến thể, giữ lại bản ghi này nhưng set ID về NULL</w:t>
+      </w:r>
+    </w:p>
+    <w:p>
+      <w:pPr>
+        <w:rPr>
+          <w:rFonts w:hint="default"/>
+        </w:rPr>
+      </w:pPr>
+      <w:r>
+        <w:rPr>
+          <w:rFonts w:hint="default"/>
+        </w:rPr>
+        <w:t xml:space="preserve">    CONSTRAINT fk_item_product FOREIGN KEY (product_id) </w:t>
+      </w:r>
+    </w:p>
+    <w:p>
+      <w:pPr>
+        <w:rPr>
+          <w:rFonts w:hint="default"/>
+        </w:rPr>
+      </w:pPr>
+      <w:r>
+        <w:rPr>
+          <w:rFonts w:hint="default"/>
+        </w:rPr>
+        <w:t xml:space="preserve">        REFERENCES products(id) ON DELETE SET NULL,</w:t>
+      </w:r>
+    </w:p>
+    <w:p>
+      <w:pPr>
+        <w:rPr>
+          <w:rFonts w:hint="default"/>
+        </w:rPr>
+      </w:pPr>
+      <w:r>
+        <w:rPr>
+          <w:rFonts w:hint="default"/>
+        </w:rPr>
+        <w:t xml:space="preserve">        </w:t>
+      </w:r>
+    </w:p>
+    <w:p>
+      <w:pPr>
+        <w:rPr>
+          <w:rFonts w:hint="default"/>
+        </w:rPr>
+      </w:pPr>
+      <w:r>
+        <w:rPr>
+          <w:rFonts w:hint="default"/>
+        </w:rPr>
+        <w:t xml:space="preserve">    CONSTRAINT fk_item_variant FOREIGN KEY (variant_id) </w:t>
+      </w:r>
+    </w:p>
+    <w:p>
+      <w:pPr>
+        <w:rPr>
+          <w:rFonts w:hint="default"/>
+        </w:rPr>
+      </w:pPr>
+      <w:r>
+        <w:rPr>
+          <w:rFonts w:hint="default"/>
+        </w:rPr>
+        <w:t xml:space="preserve">        REFERENCES product_variants(id) ON DELETE SET NULL</w:t>
+      </w:r>
+    </w:p>
+    <w:p>
+      <w:pPr>
+        <w:rPr>
+          <w:rFonts w:hint="default"/>
+        </w:rPr>
+      </w:pPr>
+      <w:r>
+        <w:rPr>
+          <w:rFonts w:hint="default"/>
+        </w:rPr>
+        <w:t>);</w:t>
+      </w:r>
     </w:p>
     <w:sectPr>
       <w:pgSz w:w="11906" w:h="16838"/>
@@ -1788,7 +2402,7 @@
     <w:lsdException w:qFormat="1" w:unhideWhenUsed="0" w:uiPriority="0" w:semiHidden="0" w:name="List 2"/>
     <w:lsdException w:qFormat="1" w:unhideWhenUsed="0" w:uiPriority="0" w:semiHidden="0" w:name="List 3"/>
     <w:lsdException w:qFormat="1" w:unhideWhenUsed="0" w:uiPriority="0" w:semiHidden="0" w:name="List 4"/>
-    <w:lsdException w:unhideWhenUsed="0" w:uiPriority="0" w:semiHidden="0" w:name="List 5"/>
+    <w:lsdException w:qFormat="1" w:unhideWhenUsed="0" w:uiPriority="0" w:semiHidden="0" w:name="List 5"/>
     <w:lsdException w:qFormat="1" w:unhideWhenUsed="0" w:uiPriority="0" w:semiHidden="0" w:name="List Bullet 2"/>
     <w:lsdException w:qFormat="1" w:unhideWhenUsed="0" w:uiPriority="0" w:semiHidden="0" w:name="List Bullet 3"/>
     <w:lsdException w:qFormat="1" w:unhideWhenUsed="0" w:uiPriority="0" w:semiHidden="0" w:name="List Bullet 4"/>
@@ -1898,7 +2512,7 @@
     <w:lsdException w:unhideWhenUsed="0" w:uiPriority="70" w:semiHidden="0" w:name="Dark List"/>
     <w:lsdException w:unhideWhenUsed="0" w:uiPriority="71" w:semiHidden="0" w:name="Colorful Shading"/>
     <w:lsdException w:unhideWhenUsed="0" w:uiPriority="72" w:semiHidden="0" w:name="Colorful List"/>
-    <w:lsdException w:unhideWhenUsed="0" w:uiPriority="73" w:semiHidden="0" w:name="Colorful Grid"/>
+    <w:lsdException w:qFormat="1" w:unhideWhenUsed="0" w:uiPriority="73" w:semiHidden="0" w:name="Colorful Grid"/>
     <w:lsdException w:qFormat="1" w:unhideWhenUsed="0" w:uiPriority="60" w:semiHidden="0" w:name="Light Shading Accent 1"/>
     <w:lsdException w:unhideWhenUsed="0" w:uiPriority="61" w:semiHidden="0" w:name="Light List Accent 1"/>
     <w:lsdException w:unhideWhenUsed="0" w:uiPriority="62" w:semiHidden="0" w:name="Light Grid Accent 1"/>
@@ -2751,6 +3365,7 @@
   <w:style w:type="paragraph" w:styleId="67">
     <w:name w:val="List 5"/>
     <w:basedOn w:val="1"/>
+    <w:qFormat/>
     <w:uiPriority w:val="0"/>
     <w:pPr>
       <w:ind w:left="100" w:leftChars="800" w:hanging="200" w:hangingChars="200"/>
@@ -15328,6 +15943,7 @@
   <w:style w:type="table" w:styleId="242">
     <w:name w:val="Colorful Grid"/>
     <w:basedOn w:val="12"/>
+    <w:qFormat/>
     <w:uiPriority w:val="73"/>
     <w:rPr>
       <w:color w:val="000000"/>

</xml_diff>

<commit_message>
API - UI UX Review, admin seller
</commit_message>
<xml_diff>
--- a/tmdt.docx
+++ b/tmdt.docx
@@ -1815,6 +1815,344 @@
         </w:rPr>
         <w:t>order_items</w:t>
       </w:r>
+    </w:p>
+    <w:p>
+      <w:pPr>
+        <w:rPr>
+          <w:rFonts w:hint="default"/>
+        </w:rPr>
+      </w:pPr>
+      <w:r>
+        <w:rPr>
+          <w:rFonts w:hint="default"/>
+        </w:rPr>
+        <w:t>CREATE TABLE order_items (</w:t>
+      </w:r>
+    </w:p>
+    <w:p>
+      <w:pPr>
+        <w:rPr>
+          <w:rFonts w:hint="default"/>
+        </w:rPr>
+      </w:pPr>
+      <w:r>
+        <w:rPr>
+          <w:rFonts w:hint="default"/>
+        </w:rPr>
+        <w:t xml:space="preserve">    id INT AUTO_INCREMENT PRIMARY KEY,</w:t>
+      </w:r>
+    </w:p>
+    <w:p>
+      <w:pPr>
+        <w:rPr>
+          <w:rFonts w:hint="default"/>
+        </w:rPr>
+      </w:pPr>
+      <w:r>
+        <w:rPr>
+          <w:rFonts w:hint="default"/>
+        </w:rPr>
+        <w:t xml:space="preserve">    order_id INT NOT NULL,</w:t>
+      </w:r>
+    </w:p>
+    <w:p>
+      <w:pPr>
+        <w:rPr>
+          <w:rFonts w:hint="default"/>
+        </w:rPr>
+      </w:pPr>
+      <w:r>
+        <w:rPr>
+          <w:rFonts w:hint="default"/>
+        </w:rPr>
+        <w:t xml:space="preserve">    product_id INT NULL, -- Để NULL để giữ lại lịch sử nếu sản phẩm bị xóa</w:t>
+      </w:r>
+    </w:p>
+    <w:p>
+      <w:pPr>
+        <w:rPr>
+          <w:rFonts w:hint="default"/>
+        </w:rPr>
+      </w:pPr>
+      <w:r>
+        <w:rPr>
+          <w:rFonts w:hint="default"/>
+        </w:rPr>
+        <w:t xml:space="preserve">    variant_id INT NULL, -- Để NULL để giữ lại lịch sử nếu biến thể bị xóa</w:t>
+      </w:r>
+    </w:p>
+    <w:p>
+      <w:pPr>
+        <w:rPr>
+          <w:rFonts w:hint="default"/>
+        </w:rPr>
+      </w:pPr>
+      <w:r>
+        <w:rPr>
+          <w:rFonts w:hint="default"/>
+        </w:rPr>
+        <w:t xml:space="preserve">    price DECIMAL(15, 2) NOT NULL COMMENT 'Giá tại thời điểm mua',</w:t>
+      </w:r>
+    </w:p>
+    <w:p>
+      <w:pPr>
+        <w:rPr>
+          <w:rFonts w:hint="default"/>
+        </w:rPr>
+      </w:pPr>
+      <w:r>
+        <w:rPr>
+          <w:rFonts w:hint="default"/>
+        </w:rPr>
+        <w:t xml:space="preserve">    quantity INT NOT NULL DEFAULT 1,</w:t>
+      </w:r>
+    </w:p>
+    <w:p>
+      <w:pPr>
+        <w:rPr>
+          <w:rFonts w:hint="default"/>
+        </w:rPr>
+      </w:pPr>
+      <w:r>
+        <w:rPr>
+          <w:rFonts w:hint="default"/>
+        </w:rPr>
+        <w:t xml:space="preserve">    isReview TINYINT DEFAULT 0 COMMENT '0: Chưa review, 1: Đã review',</w:t>
+      </w:r>
+    </w:p>
+    <w:p>
+      <w:pPr>
+        <w:rPr>
+          <w:rFonts w:hint="default"/>
+        </w:rPr>
+      </w:pPr>
+      <w:r>
+        <w:rPr>
+          <w:rFonts w:hint="default"/>
+        </w:rPr>
+        <w:t xml:space="preserve">    </w:t>
+      </w:r>
+    </w:p>
+    <w:p>
+      <w:pPr>
+        <w:rPr>
+          <w:rFonts w:hint="default"/>
+        </w:rPr>
+      </w:pPr>
+      <w:r>
+        <w:rPr>
+          <w:rFonts w:hint="default"/>
+        </w:rPr>
+        <w:t xml:space="preserve">    created_at TIMESTAMP DEFAULT CURRENT_TIMESTAMP,</w:t>
+      </w:r>
+    </w:p>
+    <w:p>
+      <w:pPr>
+        <w:rPr>
+          <w:rFonts w:hint="default"/>
+        </w:rPr>
+      </w:pPr>
+    </w:p>
+    <w:p>
+      <w:pPr>
+        <w:rPr>
+          <w:rFonts w:hint="default"/>
+        </w:rPr>
+      </w:pPr>
+      <w:r>
+        <w:rPr>
+          <w:rFonts w:hint="default"/>
+        </w:rPr>
+        <w:t xml:space="preserve">    -- Khóa ngoại: Khi xóa đơn hàng (orders) thì chi tiết này mới bị xóa theo (CASCADE)</w:t>
+      </w:r>
+    </w:p>
+    <w:p>
+      <w:pPr>
+        <w:rPr>
+          <w:rFonts w:hint="default"/>
+        </w:rPr>
+      </w:pPr>
+      <w:r>
+        <w:rPr>
+          <w:rFonts w:hint="default"/>
+        </w:rPr>
+        <w:t xml:space="preserve">    CONSTRAINT fk_item_order FOREIGN KEY (order_id) </w:t>
+      </w:r>
+    </w:p>
+    <w:p>
+      <w:pPr>
+        <w:rPr>
+          <w:rFonts w:hint="default"/>
+        </w:rPr>
+      </w:pPr>
+      <w:r>
+        <w:rPr>
+          <w:rFonts w:hint="default"/>
+        </w:rPr>
+        <w:t xml:space="preserve">        REFERENCES orders(id) ON DELETE CASCADE,</w:t>
+      </w:r>
+    </w:p>
+    <w:p>
+      <w:pPr>
+        <w:rPr>
+          <w:rFonts w:hint="default"/>
+        </w:rPr>
+      </w:pPr>
+      <w:r>
+        <w:rPr>
+          <w:rFonts w:hint="default"/>
+        </w:rPr>
+        <w:t xml:space="preserve">        </w:t>
+      </w:r>
+    </w:p>
+    <w:p>
+      <w:pPr>
+        <w:rPr>
+          <w:rFonts w:hint="default"/>
+        </w:rPr>
+      </w:pPr>
+      <w:r>
+        <w:rPr>
+          <w:rFonts w:hint="default"/>
+        </w:rPr>
+        <w:t xml:space="preserve">    -- Khóa ngoại: Khi xóa sản phẩm/biến thể, giữ lại bản ghi này nhưng set ID về NULL</w:t>
+      </w:r>
+    </w:p>
+    <w:p>
+      <w:pPr>
+        <w:rPr>
+          <w:rFonts w:hint="default"/>
+        </w:rPr>
+      </w:pPr>
+      <w:r>
+        <w:rPr>
+          <w:rFonts w:hint="default"/>
+        </w:rPr>
+        <w:t xml:space="preserve">    CONSTRAINT fk_item_product FOREIGN KEY (product_id) </w:t>
+      </w:r>
+    </w:p>
+    <w:p>
+      <w:pPr>
+        <w:rPr>
+          <w:rFonts w:hint="default"/>
+        </w:rPr>
+      </w:pPr>
+      <w:r>
+        <w:rPr>
+          <w:rFonts w:hint="default"/>
+        </w:rPr>
+        <w:t xml:space="preserve">        REFERENCES products(id) ON DELETE SET NULL,</w:t>
+      </w:r>
+    </w:p>
+    <w:p>
+      <w:pPr>
+        <w:rPr>
+          <w:rFonts w:hint="default"/>
+        </w:rPr>
+      </w:pPr>
+      <w:r>
+        <w:rPr>
+          <w:rFonts w:hint="default"/>
+        </w:rPr>
+        <w:t xml:space="preserve">       </w:t>
+      </w:r>
+    </w:p>
+    <w:p>
+      <w:pPr>
+        <w:rPr>
+          <w:rFonts w:hint="default"/>
+        </w:rPr>
+      </w:pPr>
+      <w:r>
+        <w:rPr>
+          <w:rFonts w:hint="default"/>
+        </w:rPr>
+        <w:t xml:space="preserve">    CONSTRAINT fk_item_variant FOREIGN KEY (variant_id) </w:t>
+      </w:r>
+    </w:p>
+    <w:p>
+      <w:pPr>
+        <w:rPr>
+          <w:rFonts w:hint="default"/>
+        </w:rPr>
+      </w:pPr>
+      <w:r>
+        <w:rPr>
+          <w:rFonts w:hint="default"/>
+        </w:rPr>
+        <w:t xml:space="preserve">        REFERENCES product_variants(id) ON DELETE SET NULL</w:t>
+      </w:r>
+    </w:p>
+    <w:p>
+      <w:pPr>
+        <w:rPr>
+          <w:rFonts w:hint="default"/>
+        </w:rPr>
+      </w:pPr>
+      <w:r>
+        <w:rPr>
+          <w:rFonts w:hint="default"/>
+        </w:rPr>
+        <w:t>);</w:t>
+      </w:r>
+    </w:p>
+    <w:p>
+      <w:pPr>
+        <w:rPr>
+          <w:rFonts w:hint="default"/>
+        </w:rPr>
+      </w:pPr>
+      <w:r>
+        <w:rPr>
+          <w:rFonts w:hint="default"/>
+        </w:rPr>
+        <w:br w:type="textWrapping"/>
+      </w:r>
+      <w:r>
+        <w:rPr>
+          <w:rFonts w:hint="default"/>
+        </w:rPr>
+        <w:t>-- 12. Tạo bảng reviews</w:t>
+      </w:r>
+    </w:p>
+    <w:p>
+      <w:pPr>
+        <w:rPr>
+          <w:rFonts w:hint="default"/>
+        </w:rPr>
+      </w:pPr>
+      <w:r>
+        <w:rPr>
+          <w:rFonts w:hint="default"/>
+        </w:rPr>
+        <w:t>CREATE TABLE reviews (</w:t>
+      </w:r>
+    </w:p>
+    <w:p>
+      <w:pPr>
+        <w:rPr>
+          <w:rFonts w:hint="default"/>
+        </w:rPr>
+      </w:pPr>
+      <w:r>
+        <w:rPr>
+          <w:rFonts w:hint="default"/>
+        </w:rPr>
+        <w:t xml:space="preserve">    id INT AUTO_INCREMENT PRIMARY KEY,</w:t>
+      </w:r>
+    </w:p>
+    <w:p>
+      <w:pPr>
+        <w:rPr>
+          <w:rFonts w:hint="default"/>
+        </w:rPr>
+      </w:pPr>
+      <w:r>
+        <w:rPr>
+          <w:rFonts w:hint="default"/>
+        </w:rPr>
+        <w:t xml:space="preserve">    user_id INT NULL,</w:t>
+      </w:r>
       <w:bookmarkStart w:id="0" w:name="_GoBack"/>
       <w:bookmarkEnd w:id="0"/>
     </w:p>
@@ -1828,7 +2166,216 @@
         <w:rPr>
           <w:rFonts w:hint="default"/>
         </w:rPr>
-        <w:t>CREATE TABLE order_items (</w:t>
+        <w:t xml:space="preserve">    product_id INT NOT NULL,</w:t>
+      </w:r>
+    </w:p>
+    <w:p>
+      <w:pPr>
+        <w:rPr>
+          <w:rFonts w:hint="default"/>
+        </w:rPr>
+      </w:pPr>
+      <w:r>
+        <w:rPr>
+          <w:rFonts w:hint="default"/>
+        </w:rPr>
+        <w:t xml:space="preserve">    orderItem_id INT NOT NULL,</w:t>
+      </w:r>
+    </w:p>
+    <w:p>
+      <w:pPr>
+        <w:rPr>
+          <w:rFonts w:hint="default"/>
+        </w:rPr>
+      </w:pPr>
+      <w:r>
+        <w:rPr>
+          <w:rFonts w:hint="default"/>
+        </w:rPr>
+        <w:t xml:space="preserve">    content TEXT,</w:t>
+      </w:r>
+    </w:p>
+    <w:p>
+      <w:pPr>
+        <w:rPr>
+          <w:rFonts w:hint="default"/>
+        </w:rPr>
+      </w:pPr>
+      <w:r>
+        <w:rPr>
+          <w:rFonts w:hint="default"/>
+        </w:rPr>
+        <w:t xml:space="preserve">    point TINYINT NOT NULL COMMENT 'Số sao đánh giá',</w:t>
+      </w:r>
+    </w:p>
+    <w:p>
+      <w:pPr>
+        <w:rPr>
+          <w:rFonts w:hint="default"/>
+        </w:rPr>
+      </w:pPr>
+      <w:r>
+        <w:rPr>
+          <w:rFonts w:hint="default"/>
+        </w:rPr>
+        <w:t xml:space="preserve">    created_at TIMESTAMP DEFAULT CURRENT_TIMESTAMP,</w:t>
+      </w:r>
+    </w:p>
+    <w:p>
+      <w:pPr>
+        <w:rPr>
+          <w:rFonts w:hint="default"/>
+        </w:rPr>
+      </w:pPr>
+      <w:r>
+        <w:rPr>
+          <w:rFonts w:hint="default"/>
+        </w:rPr>
+        <w:t xml:space="preserve">    updated_at TIMESTAMP DEFAULT CURRENT_TIMESTAMP ON UPDATE CURRENT_TIMESTAMP,</w:t>
+      </w:r>
+    </w:p>
+    <w:p>
+      <w:pPr>
+        <w:rPr>
+          <w:rFonts w:hint="default"/>
+        </w:rPr>
+      </w:pPr>
+    </w:p>
+    <w:p>
+      <w:pPr>
+        <w:rPr>
+          <w:rFonts w:hint="default"/>
+        </w:rPr>
+      </w:pPr>
+      <w:r>
+        <w:rPr>
+          <w:rFonts w:hint="default"/>
+        </w:rPr>
+        <w:t xml:space="preserve">    -- Khóa ngoại</w:t>
+      </w:r>
+    </w:p>
+    <w:p>
+      <w:pPr>
+        <w:rPr>
+          <w:rFonts w:hint="default"/>
+        </w:rPr>
+      </w:pPr>
+      <w:r>
+        <w:rPr>
+          <w:rFonts w:hint="default"/>
+        </w:rPr>
+        <w:t xml:space="preserve">    CONSTRAINT fk_review_user FOREIGN KEY (user_id) </w:t>
+      </w:r>
+    </w:p>
+    <w:p>
+      <w:pPr>
+        <w:rPr>
+          <w:rFonts w:hint="default"/>
+        </w:rPr>
+      </w:pPr>
+      <w:r>
+        <w:rPr>
+          <w:rFonts w:hint="default"/>
+        </w:rPr>
+        <w:t xml:space="preserve">        REFERENCES users(id) ON DELETE SET NULL,</w:t>
+      </w:r>
+    </w:p>
+    <w:p>
+      <w:pPr>
+        <w:rPr>
+          <w:rFonts w:hint="default"/>
+        </w:rPr>
+      </w:pPr>
+      <w:r>
+        <w:rPr>
+          <w:rFonts w:hint="default"/>
+        </w:rPr>
+        <w:t xml:space="preserve">    CONSTRAINT fk_review_product FOREIGN KEY (product_id) </w:t>
+      </w:r>
+    </w:p>
+    <w:p>
+      <w:pPr>
+        <w:rPr>
+          <w:rFonts w:hint="default"/>
+        </w:rPr>
+      </w:pPr>
+      <w:r>
+        <w:rPr>
+          <w:rFonts w:hint="default"/>
+        </w:rPr>
+        <w:t xml:space="preserve">        REFERENCES products(id) ON DELETE CASCADE,</w:t>
+      </w:r>
+    </w:p>
+    <w:p>
+      <w:pPr>
+        <w:rPr>
+          <w:rFonts w:hint="default"/>
+        </w:rPr>
+      </w:pPr>
+      <w:r>
+        <w:rPr>
+          <w:rFonts w:hint="default"/>
+        </w:rPr>
+        <w:t xml:space="preserve">    CONSTRAINT fk_review_orderItem FOREIGN KEY (orderItem_id) </w:t>
+      </w:r>
+    </w:p>
+    <w:p>
+      <w:pPr>
+        <w:rPr>
+          <w:rFonts w:hint="default"/>
+        </w:rPr>
+      </w:pPr>
+      <w:r>
+        <w:rPr>
+          <w:rFonts w:hint="default"/>
+        </w:rPr>
+        <w:t xml:space="preserve">        REFERENCES order_items(id) ON DELETE CASCADE</w:t>
+      </w:r>
+    </w:p>
+    <w:p>
+      <w:pPr>
+        <w:rPr>
+          <w:rFonts w:hint="default"/>
+        </w:rPr>
+      </w:pPr>
+      <w:r>
+        <w:rPr>
+          <w:rFonts w:hint="default"/>
+        </w:rPr>
+        <w:t>);</w:t>
+      </w:r>
+    </w:p>
+    <w:p>
+      <w:pPr>
+        <w:rPr>
+          <w:rFonts w:hint="default"/>
+        </w:rPr>
+      </w:pPr>
+    </w:p>
+    <w:p>
+      <w:pPr>
+        <w:rPr>
+          <w:rFonts w:hint="default"/>
+        </w:rPr>
+      </w:pPr>
+      <w:r>
+        <w:rPr>
+          <w:rFonts w:hint="default"/>
+        </w:rPr>
+        <w:t>-- 13. Tạo bảng review_medias</w:t>
+      </w:r>
+    </w:p>
+    <w:p>
+      <w:pPr>
+        <w:rPr>
+          <w:rFonts w:hint="default"/>
+        </w:rPr>
+      </w:pPr>
+      <w:r>
+        <w:rPr>
+          <w:rFonts w:hint="default"/>
+        </w:rPr>
+        <w:t>CREATE TABLE review_medias (</w:t>
       </w:r>
     </w:p>
     <w:p>
@@ -1854,235 +2401,66 @@
         <w:rPr>
           <w:rFonts w:hint="default"/>
         </w:rPr>
-        <w:t xml:space="preserve">    order_id INT NOT NULL,</w:t>
-      </w:r>
-    </w:p>
-    <w:p>
-      <w:pPr>
-        <w:rPr>
-          <w:rFonts w:hint="default"/>
-        </w:rPr>
-      </w:pPr>
-      <w:r>
-        <w:rPr>
-          <w:rFonts w:hint="default"/>
-        </w:rPr>
-        <w:t xml:space="preserve">    product_id INT NULL, -- Để NULL để giữ lại lịch sử nếu sản phẩm bị xóa</w:t>
-      </w:r>
-    </w:p>
-    <w:p>
-      <w:pPr>
-        <w:rPr>
-          <w:rFonts w:hint="default"/>
-        </w:rPr>
-      </w:pPr>
-      <w:r>
-        <w:rPr>
-          <w:rFonts w:hint="default"/>
-        </w:rPr>
-        <w:t xml:space="preserve">    variant_id INT NULL, -- Để NULL để giữ lại lịch sử nếu biến thể bị xóa</w:t>
-      </w:r>
-    </w:p>
-    <w:p>
-      <w:pPr>
-        <w:rPr>
-          <w:rFonts w:hint="default"/>
-        </w:rPr>
-      </w:pPr>
-      <w:r>
-        <w:rPr>
-          <w:rFonts w:hint="default"/>
-        </w:rPr>
-        <w:t xml:space="preserve">    price DECIMAL(15, 2) NOT NULL COMMENT 'Giá tại thời điểm mua',</w:t>
-      </w:r>
-    </w:p>
-    <w:p>
-      <w:pPr>
-        <w:rPr>
-          <w:rFonts w:hint="default"/>
-        </w:rPr>
-      </w:pPr>
-      <w:r>
-        <w:rPr>
-          <w:rFonts w:hint="default"/>
-        </w:rPr>
-        <w:t xml:space="preserve">    quantity INT NOT NULL DEFAULT 1,</w:t>
-      </w:r>
-    </w:p>
-    <w:p>
-      <w:pPr>
-        <w:rPr>
-          <w:rFonts w:hint="default"/>
-        </w:rPr>
-      </w:pPr>
-      <w:r>
-        <w:rPr>
-          <w:rFonts w:hint="default"/>
-        </w:rPr>
-        <w:t xml:space="preserve">    isReview TINYINT DEFAULT 0 COMMENT '0: Chưa review, 1: Đã review',</w:t>
-      </w:r>
-    </w:p>
-    <w:p>
-      <w:pPr>
-        <w:rPr>
-          <w:rFonts w:hint="default"/>
-        </w:rPr>
-      </w:pPr>
-      <w:r>
-        <w:rPr>
-          <w:rFonts w:hint="default"/>
-        </w:rPr>
-        <w:t xml:space="preserve">    </w:t>
-      </w:r>
-    </w:p>
-    <w:p>
-      <w:pPr>
-        <w:rPr>
-          <w:rFonts w:hint="default"/>
-        </w:rPr>
-      </w:pPr>
-      <w:r>
-        <w:rPr>
-          <w:rFonts w:hint="default"/>
-        </w:rPr>
-        <w:t xml:space="preserve">    created_at TIMESTAMP DEFAULT CURRENT_TIMESTAMP,</w:t>
-      </w:r>
-    </w:p>
-    <w:p>
-      <w:pPr>
-        <w:rPr>
-          <w:rFonts w:hint="default"/>
-        </w:rPr>
-      </w:pPr>
-    </w:p>
-    <w:p>
-      <w:pPr>
-        <w:rPr>
-          <w:rFonts w:hint="default"/>
-        </w:rPr>
-      </w:pPr>
-      <w:r>
-        <w:rPr>
-          <w:rFonts w:hint="default"/>
-        </w:rPr>
-        <w:t xml:space="preserve">    -- Khóa ngoại: Khi xóa đơn hàng (orders) thì chi tiết này mới bị xóa theo (CASCADE)</w:t>
-      </w:r>
-    </w:p>
-    <w:p>
-      <w:pPr>
-        <w:rPr>
-          <w:rFonts w:hint="default"/>
-        </w:rPr>
-      </w:pPr>
-      <w:r>
-        <w:rPr>
-          <w:rFonts w:hint="default"/>
-        </w:rPr>
-        <w:t xml:space="preserve">    CONSTRAINT fk_item_order FOREIGN KEY (order_id) </w:t>
-      </w:r>
-    </w:p>
-    <w:p>
-      <w:pPr>
-        <w:rPr>
-          <w:rFonts w:hint="default"/>
-        </w:rPr>
-      </w:pPr>
-      <w:r>
-        <w:rPr>
-          <w:rFonts w:hint="default"/>
-        </w:rPr>
-        <w:t xml:space="preserve">        REFERENCES orders(id) ON DELETE CASCADE,</w:t>
-      </w:r>
-    </w:p>
-    <w:p>
-      <w:pPr>
-        <w:rPr>
-          <w:rFonts w:hint="default"/>
-        </w:rPr>
-      </w:pPr>
-      <w:r>
-        <w:rPr>
-          <w:rFonts w:hint="default"/>
-        </w:rPr>
-        <w:t xml:space="preserve">        </w:t>
-      </w:r>
-    </w:p>
-    <w:p>
-      <w:pPr>
-        <w:rPr>
-          <w:rFonts w:hint="default"/>
-        </w:rPr>
-      </w:pPr>
-      <w:r>
-        <w:rPr>
-          <w:rFonts w:hint="default"/>
-        </w:rPr>
-        <w:t xml:space="preserve">    -- Khóa ngoại: Khi xóa sản phẩm/biến thể, giữ lại bản ghi này nhưng set ID về NULL</w:t>
-      </w:r>
-    </w:p>
-    <w:p>
-      <w:pPr>
-        <w:rPr>
-          <w:rFonts w:hint="default"/>
-        </w:rPr>
-      </w:pPr>
-      <w:r>
-        <w:rPr>
-          <w:rFonts w:hint="default"/>
-        </w:rPr>
-        <w:t xml:space="preserve">    CONSTRAINT fk_item_product FOREIGN KEY (product_id) </w:t>
-      </w:r>
-    </w:p>
-    <w:p>
-      <w:pPr>
-        <w:rPr>
-          <w:rFonts w:hint="default"/>
-        </w:rPr>
-      </w:pPr>
-      <w:r>
-        <w:rPr>
-          <w:rFonts w:hint="default"/>
-        </w:rPr>
-        <w:t xml:space="preserve">        REFERENCES products(id) ON DELETE SET NULL,</w:t>
-      </w:r>
-    </w:p>
-    <w:p>
-      <w:pPr>
-        <w:rPr>
-          <w:rFonts w:hint="default"/>
-        </w:rPr>
-      </w:pPr>
-      <w:r>
-        <w:rPr>
-          <w:rFonts w:hint="default"/>
-        </w:rPr>
-        <w:t xml:space="preserve">        </w:t>
-      </w:r>
-    </w:p>
-    <w:p>
-      <w:pPr>
-        <w:rPr>
-          <w:rFonts w:hint="default"/>
-        </w:rPr>
-      </w:pPr>
-      <w:r>
-        <w:rPr>
-          <w:rFonts w:hint="default"/>
-        </w:rPr>
-        <w:t xml:space="preserve">    CONSTRAINT fk_item_variant FOREIGN KEY (variant_id) </w:t>
-      </w:r>
-    </w:p>
-    <w:p>
-      <w:pPr>
-        <w:rPr>
-          <w:rFonts w:hint="default"/>
-        </w:rPr>
-      </w:pPr>
-      <w:r>
-        <w:rPr>
-          <w:rFonts w:hint="default"/>
-        </w:rPr>
-        <w:t xml:space="preserve">        REFERENCES product_variants(id) ON DELETE SET NULL</w:t>
+        <w:t xml:space="preserve">    review_id INT NOT NULL,</w:t>
+      </w:r>
+    </w:p>
+    <w:p>
+      <w:pPr>
+        <w:rPr>
+          <w:rFonts w:hint="default"/>
+        </w:rPr>
+      </w:pPr>
+      <w:r>
+        <w:rPr>
+          <w:rFonts w:hint="default"/>
+        </w:rPr>
+        <w:t xml:space="preserve">    image VARCHAR(255) NOT NULL,</w:t>
+      </w:r>
+    </w:p>
+    <w:p>
+      <w:pPr>
+        <w:rPr>
+          <w:rFonts w:hint="default"/>
+        </w:rPr>
+      </w:pPr>
+    </w:p>
+    <w:p>
+      <w:pPr>
+        <w:rPr>
+          <w:rFonts w:hint="default"/>
+        </w:rPr>
+      </w:pPr>
+      <w:r>
+        <w:rPr>
+          <w:rFonts w:hint="default"/>
+        </w:rPr>
+        <w:t xml:space="preserve">    -- Khóa ngoại</w:t>
+      </w:r>
+    </w:p>
+    <w:p>
+      <w:pPr>
+        <w:rPr>
+          <w:rFonts w:hint="default"/>
+        </w:rPr>
+      </w:pPr>
+      <w:r>
+        <w:rPr>
+          <w:rFonts w:hint="default"/>
+        </w:rPr>
+        <w:t xml:space="preserve">    CONSTRAINT fk_media_review FOREIGN KEY (review_id) </w:t>
+      </w:r>
+    </w:p>
+    <w:p>
+      <w:pPr>
+        <w:rPr>
+          <w:rFonts w:hint="default"/>
+        </w:rPr>
+      </w:pPr>
+      <w:r>
+        <w:rPr>
+          <w:rFonts w:hint="default"/>
+        </w:rPr>
+        <w:t xml:space="preserve">        REFERENCES reviews(id) ON DELETE CASCADE</w:t>
       </w:r>
     </w:p>
     <w:p>
@@ -2416,7 +2794,7 @@
     <w:lsdException w:qFormat="1" w:unhideWhenUsed="0" w:uiPriority="0" w:semiHidden="0" w:name="Signature"/>
     <w:lsdException w:qFormat="1" w:unhideWhenUsed="0" w:uiPriority="0" w:name="Default Paragraph Font"/>
     <w:lsdException w:qFormat="1" w:unhideWhenUsed="0" w:uiPriority="0" w:semiHidden="0" w:name="Body Text"/>
-    <w:lsdException w:unhideWhenUsed="0" w:uiPriority="0" w:semiHidden="0" w:name="Body Text Indent"/>
+    <w:lsdException w:qFormat="1" w:unhideWhenUsed="0" w:uiPriority="0" w:semiHidden="0" w:name="Body Text Indent"/>
     <w:lsdException w:qFormat="1" w:unhideWhenUsed="0" w:uiPriority="0" w:semiHidden="0" w:name="List Continue"/>
     <w:lsdException w:qFormat="1" w:unhideWhenUsed="0" w:uiPriority="0" w:semiHidden="0" w:name="List Continue 2"/>
     <w:lsdException w:qFormat="1" w:unhideWhenUsed="0" w:uiPriority="0" w:semiHidden="0" w:name="List Continue 3"/>
@@ -2874,6 +3252,7 @@
   <w:style w:type="paragraph" w:styleId="19">
     <w:name w:val="Body Text Indent"/>
     <w:basedOn w:val="1"/>
+    <w:qFormat/>
     <w:uiPriority w:val="0"/>
     <w:pPr>
       <w:spacing w:after="120"/>

</xml_diff>